<commit_message>
docs: enrich portfolio summary with Domain E innovations and all system modules
</commit_message>
<xml_diff>
--- a/PROJECT_PORTFOLIO_EXECUTIVE_SUMMARY.docx
+++ b/PROJECT_PORTFOLIO_EXECUTIVE_SUMMARY.docx
@@ -676,10 +676,98 @@
     </w:p>
     <w:p>
       <w:pPr>
+        <w:spacing w:after="40"/>
+      </w:pPr>
+      <w:r>
+        <w:t xml:space="preserve">4. Suite Management &amp; Review Moderation: Add/edit rooms and moderate guest reviews.</w:t>
+      </w:r>
+    </w:p>
+    <w:p>
+      <w:pPr>
+        <w:spacing w:after="140"/>
+      </w:pPr>
+      <w:r>
+        <w:t xml:space="preserve">5. Staff Directory &amp; Role Provisioning: Dedicated employee onboarding and custom baseline permission templates.</w:t>
+      </w:r>
+    </w:p>
+    <w:p>
+      <w:pPr>
+        <w:pStyle w:val="Heading2"/>
+        <w:spacing w:after="80" w:before="100"/>
+        <w:rPr>
+          <w:b/>
+          <w:bCs/>
+          <w:color w:val="2B6CB0"/>
+          <w:sz w:val="24"/>
+          <w:szCs w:val="24"/>
+        </w:rPr>
+      </w:pPr>
+      <w:r>
+        <w:t xml:space="preserve">E. Advanced Cross-Cutting Modules &amp; Innovations</w:t>
+      </w:r>
+    </w:p>
+    <w:p>
+      <w:pPr>
+        <w:spacing w:after="40"/>
+      </w:pPr>
+      <w:r>
+        <w:t xml:space="preserve">1. Spotlight Command Palette (Ctrl+K): Instant keyboard-driven navigation across suites, bookings, and controls in &lt;2 keystrokes.</w:t>
+      </w:r>
+    </w:p>
+    <w:p>
+      <w:pPr>
+        <w:spacing w:after="40"/>
+      </w:pPr>
+      <w:r>
+        <w:t xml:space="preserve">2. Multi-Role AI Operations Copilot: Dual-mode assistant (Guest Concierge policy advisor + Staff operations lookups).</w:t>
+      </w:r>
+    </w:p>
+    <w:p>
+      <w:pPr>
+        <w:spacing w:after="40"/>
+      </w:pPr>
+      <w:r>
+        <w:t xml:space="preserve">3. Tiered Guest Loyalty Rewards (Bronze/Silver/Gold/Platinum): Points accrual engine unlocking exclusive member perks.</w:t>
+      </w:r>
+    </w:p>
+    <w:p>
+      <w:pPr>
+        <w:spacing w:after="40"/>
+      </w:pPr>
+      <w:r>
+        <w:t xml:space="preserve">4. High-Demand Room Waitlists: Automated waitlist subscriptions when inventory is sold out, auto-triggering on cancellations.</w:t>
+      </w:r>
+    </w:p>
+    <w:p>
+      <w:pPr>
+        <w:spacing w:after="40"/>
+      </w:pPr>
+      <w:r>
+        <w:t xml:space="preserve">5. Automated Background Watchdog Cron: 15-minute background worker auto-releasing unpaid draft reservations.</w:t>
+      </w:r>
+    </w:p>
+    <w:p>
+      <w:pPr>
+        <w:spacing w:after="40"/>
+      </w:pPr>
+      <w:r>
+        <w:t xml:space="preserve">6. Bespoke Multi-Themed Design System: Custom Obsidian Dark (Staff/Admin), Verde Emerald (Guest), Warm Planner (Housekeeping).</w:t>
+      </w:r>
+    </w:p>
+    <w:p>
+      <w:pPr>
+        <w:spacing w:after="40"/>
+      </w:pPr>
+      <w:r>
+        <w:t xml:space="preserve">7. Cloudinary Media Asset Management: Multi-image drag-and-drop suite media modal with CDN optimization.</w:t>
+      </w:r>
+    </w:p>
+    <w:p>
+      <w:pPr>
         <w:spacing w:after="200"/>
       </w:pPr>
       <w:r>
-        <w:t xml:space="preserve">4. Suite Management &amp; Review Moderation: Add/edit rooms and moderate guest reviews.</w:t>
+        <w:t xml:space="preserve">8. Interactive Swagger / OpenAPI Documentation: Live API explorer available at /api-docs.</w:t>
       </w:r>
     </w:p>
     <w:p>

</xml_diff>